<commit_message>
Update Installation Guide for AI provider setup, add matching PDF
Adds a short "Optional — Enable AI-Generated Draft Specs" section
covering the new Admin > AI Provider setup (get an Anthropic key, paste
it in, pick a model), a matching troubleshooting entry, and an appendix
row on where that key is stored. Generates the guide's PDF alongside
the Word file, matching the User Guide's existing format.

Co-Authored-By: Claude Sonnet 5 <noreply@anthropic.com>
Claude-Session: https://claude.ai/code/session_015bbirj7KLvonURfn9eEcya
</commit_message>
<xml_diff>
--- a/dynamicba/docs/DynamicBA_Installation_Guide.docx
+++ b/dynamicba/docs/DynamicBA_Installation_Guide.docx
@@ -4,7 +4,7 @@
   <w:body>
     <w:p>
       <w:pPr>
-        <w:spacing w:after="600"/>
+        <w:spacing w:after="500"/>
       </w:pPr>
     </w:p>
     <w:p>
@@ -45,10 +45,10 @@
           <w:i/>
           <w:iCs/>
           <w:color w:val="808184"/>
-          <w:sz w:val="20"/>
-          <w:szCs w:val="20"/>
-        </w:rPr>
-        <w:t xml:space="preserve">Data- and AI-led consulting</w:t>
+          <w:sz w:val="18"/>
+          <w:szCs w:val="18"/>
+        </w:rPr>
+        <w:t xml:space="preserve">Powered by DynamicBA — AI-assisted scope-to-specs automation</w:t>
       </w:r>
     </w:p>
     <w:p>
@@ -56,7 +56,7 @@
         <w:pBdr>
           <w:bottom w:val="single" w:color="E07B00" w:sz="8" w:space="8"/>
         </w:pBdr>
-        <w:spacing w:after="200" w:before="400"/>
+        <w:spacing w:after="150" w:before="300"/>
         <w:jc w:val="center"/>
       </w:pPr>
       <w:r>
@@ -65,35 +65,35 @@
           <w:b/>
           <w:bCs/>
           <w:color w:val="E07B00"/>
-          <w:sz w:val="56"/>
-          <w:szCs w:val="56"/>
-        </w:rPr>
-        <w:t xml:space="preserve">DynamicBA</w:t>
-      </w:r>
-    </w:p>
-    <w:p>
-      <w:pPr>
-        <w:spacing w:after="800"/>
+          <w:sz w:val="48"/>
+          <w:szCs w:val="48"/>
+        </w:rPr>
+        <w:t xml:space="preserve">DynamicBA — Installation Guide</w:t>
+      </w:r>
+    </w:p>
+    <w:p>
+      <w:pPr>
+        <w:spacing w:after="600"/>
         <w:jc w:val="center"/>
       </w:pPr>
       <w:r>
         <w:rPr>
           <w:rFonts w:ascii="Times New Roman" w:cs="Times New Roman" w:eastAsia="Times New Roman" w:hAnsi="Times New Roman"/>
           <w:color w:val="3A3A3C"/>
-          <w:sz w:val="28"/>
-          <w:szCs w:val="28"/>
-        </w:rPr>
-        <w:t xml:space="preserve">Installation Guide</w:t>
-      </w:r>
-    </w:p>
-    <w:p>
-      <w:pPr>
-        <w:spacing w:after="600"/>
-      </w:pPr>
-    </w:p>
-    <w:p>
-      <w:pPr>
-        <w:spacing w:after="120"/>
+          <w:sz w:val="26"/>
+          <w:szCs w:val="26"/>
+        </w:rPr>
+        <w:t xml:space="preserve">Two small programs, running on your own computer — no account, no cloud, nothing sent anywhere else</w:t>
+      </w:r>
+    </w:p>
+    <w:p>
+      <w:pPr>
+        <w:spacing w:after="400"/>
+      </w:pPr>
+    </w:p>
+    <w:p>
+      <w:pPr>
+        <w:spacing w:after="110"/>
         <w:jc w:val="center"/>
       </w:pPr>
       <w:r>
@@ -102,8 +102,60 @@
           <w:b/>
           <w:bCs/>
           <w:color w:val="808184"/>
-          <w:sz w:val="22"/>
-          <w:szCs w:val="22"/>
+          <w:sz w:val="20"/>
+          <w:szCs w:val="20"/>
+        </w:rPr>
+        <w:t xml:space="preserve">Client:  </w:t>
+      </w:r>
+      <w:r>
+        <w:rPr>
+          <w:rFonts w:ascii="Times New Roman" w:cs="Times New Roman" w:eastAsia="Times New Roman" w:hAnsi="Times New Roman"/>
+          <w:color w:val="3A3A3C"/>
+          <w:sz w:val="20"/>
+          <w:szCs w:val="20"/>
+        </w:rPr>
+        <w:t xml:space="preserve">POWERACT Consulting — Internal &amp; Client Distribution</w:t>
+      </w:r>
+    </w:p>
+    <w:p>
+      <w:pPr>
+        <w:spacing w:after="110"/>
+        <w:jc w:val="center"/>
+      </w:pPr>
+      <w:r>
+        <w:rPr>
+          <w:rFonts w:ascii="Times New Roman" w:cs="Times New Roman" w:eastAsia="Times New Roman" w:hAnsi="Times New Roman"/>
+          <w:b/>
+          <w:bCs/>
+          <w:color w:val="808184"/>
+          <w:sz w:val="20"/>
+          <w:szCs w:val="20"/>
+        </w:rPr>
+        <w:t xml:space="preserve">Project / Engagement:  </w:t>
+      </w:r>
+      <w:r>
+        <w:rPr>
+          <w:rFonts w:ascii="Times New Roman" w:cs="Times New Roman" w:eastAsia="Times New Roman" w:hAnsi="Times New Roman"/>
+          <w:color w:val="3A3A3C"/>
+          <w:sz w:val="20"/>
+          <w:szCs w:val="20"/>
+        </w:rPr>
+        <w:t xml:space="preserve">DynamicBA Platform</w:t>
+      </w:r>
+    </w:p>
+    <w:p>
+      <w:pPr>
+        <w:spacing w:after="110"/>
+        <w:jc w:val="center"/>
+      </w:pPr>
+      <w:r>
+        <w:rPr>
+          <w:rFonts w:ascii="Times New Roman" w:cs="Times New Roman" w:eastAsia="Times New Roman" w:hAnsi="Times New Roman"/>
+          <w:b/>
+          <w:bCs/>
+          <w:color w:val="808184"/>
+          <w:sz w:val="20"/>
+          <w:szCs w:val="20"/>
         </w:rPr>
         <w:t xml:space="preserve">Prepared for:  </w:t>
       </w:r>
@@ -111,15 +163,15 @@
         <w:rPr>
           <w:rFonts w:ascii="Times New Roman" w:cs="Times New Roman" w:eastAsia="Times New Roman" w:hAnsi="Times New Roman"/>
           <w:color w:val="3A3A3C"/>
-          <w:sz w:val="22"/>
-          <w:szCs w:val="22"/>
-        </w:rPr>
-        <w:t xml:space="preserve">POWERACT Consulting — DynamicBA Users</w:t>
-      </w:r>
-    </w:p>
-    <w:p>
-      <w:pPr>
-        <w:spacing w:after="120"/>
+          <w:sz w:val="20"/>
+          <w:szCs w:val="20"/>
+        </w:rPr>
+        <w:t xml:space="preserve">DynamicBA Users</w:t>
+      </w:r>
+    </w:p>
+    <w:p>
+      <w:pPr>
+        <w:spacing w:after="110"/>
         <w:jc w:val="center"/>
       </w:pPr>
       <w:r>
@@ -128,8 +180,8 @@
           <w:b/>
           <w:bCs/>
           <w:color w:val="808184"/>
-          <w:sz w:val="22"/>
-          <w:szCs w:val="22"/>
+          <w:sz w:val="20"/>
+          <w:szCs w:val="20"/>
         </w:rPr>
         <w:t xml:space="preserve">Prepared by:  </w:t>
       </w:r>
@@ -137,15 +189,15 @@
         <w:rPr>
           <w:rFonts w:ascii="Times New Roman" w:cs="Times New Roman" w:eastAsia="Times New Roman" w:hAnsi="Times New Roman"/>
           <w:color w:val="3A3A3C"/>
-          <w:sz w:val="22"/>
-          <w:szCs w:val="22"/>
+          <w:sz w:val="20"/>
+          <w:szCs w:val="20"/>
         </w:rPr>
         <w:t xml:space="preserve">DynamicBA Engineering</w:t>
       </w:r>
     </w:p>
     <w:p>
       <w:pPr>
-        <w:spacing w:after="120"/>
+        <w:spacing w:after="110"/>
         <w:jc w:val="center"/>
       </w:pPr>
       <w:r>
@@ -154,24 +206,24 @@
           <w:b/>
           <w:bCs/>
           <w:color w:val="808184"/>
-          <w:sz w:val="22"/>
-          <w:szCs w:val="22"/>
-        </w:rPr>
-        <w:t xml:space="preserve">Version:  </w:t>
+          <w:sz w:val="20"/>
+          <w:szCs w:val="20"/>
+        </w:rPr>
+        <w:t xml:space="preserve">Date:  </w:t>
       </w:r>
       <w:r>
         <w:rPr>
           <w:rFonts w:ascii="Times New Roman" w:cs="Times New Roman" w:eastAsia="Times New Roman" w:hAnsi="Times New Roman"/>
           <w:color w:val="3A3A3C"/>
-          <w:sz w:val="22"/>
-          <w:szCs w:val="22"/>
-        </w:rPr>
-        <w:t xml:space="preserve">2.0</w:t>
-      </w:r>
-    </w:p>
-    <w:p>
-      <w:pPr>
-        <w:spacing w:after="120"/>
+          <w:sz w:val="20"/>
+          <w:szCs w:val="20"/>
+        </w:rPr>
+        <w:t xml:space="preserve">2026-09-22</w:t>
+      </w:r>
+    </w:p>
+    <w:p>
+      <w:pPr>
+        <w:spacing w:after="110"/>
         <w:jc w:val="center"/>
       </w:pPr>
       <w:r>
@@ -180,19 +232,19 @@
           <w:b/>
           <w:bCs/>
           <w:color w:val="808184"/>
-          <w:sz w:val="22"/>
-          <w:szCs w:val="22"/>
-        </w:rPr>
-        <w:t xml:space="preserve">Date:  </w:t>
+          <w:sz w:val="20"/>
+          <w:szCs w:val="20"/>
+        </w:rPr>
+        <w:t xml:space="preserve">Sign-Off Status:  </w:t>
       </w:r>
       <w:r>
         <w:rPr>
           <w:rFonts w:ascii="Times New Roman" w:cs="Times New Roman" w:eastAsia="Times New Roman" w:hAnsi="Times New Roman"/>
           <w:color w:val="3A3A3C"/>
-          <w:sz w:val="22"/>
-          <w:szCs w:val="22"/>
-        </w:rPr>
-        <w:t xml:space="preserve">September 2026</w:t>
+          <w:sz w:val="20"/>
+          <w:szCs w:val="20"/>
+        </w:rPr>
+        <w:t xml:space="preserve">Version 2.1</w:t>
       </w:r>
     </w:p>
     <w:p>
@@ -244,7 +296,7 @@
       <w:pPr>
         <w:sectPr>
           <w:pgSz w:w="12240" w:h="15840" w:orient="portrait"/>
-          <w:pgMar w:top="1080" w:right="1080" w:bottom="1080" w:left="1080" w:header="708" w:footer="708" w:gutter="0"/>
+          <w:pgMar w:top="1000" w:right="1000" w:bottom="1000" w:left="1000" w:header="708" w:footer="708" w:gutter="0"/>
           <w:pgNumType/>
           <w:docGrid w:linePitch="360"/>
         </w:sectPr>
@@ -290,7 +342,7 @@
         <w:pStyle w:val="ListParagraph"/>
         <w:numPr>
           <w:ilvl w:val="0"/>
-          <w:numId w:val="2"/>
+          <w:numId w:val="1"/>
         </w:numPr>
         <w:spacing w:after="100"/>
       </w:pPr>
@@ -309,7 +361,7 @@
         <w:pStyle w:val="ListParagraph"/>
         <w:numPr>
           <w:ilvl w:val="0"/>
-          <w:numId w:val="2"/>
+          <w:numId w:val="1"/>
         </w:numPr>
         <w:spacing w:after="100"/>
       </w:pPr>
@@ -339,7 +391,7 @@
           <w:sz w:val="24"/>
           <w:szCs w:val="24"/>
         </w:rPr>
-        <w:t xml:space="preserve">Nothing is sent to any outside company. There is no account to create anywhere except inside DynamicBA itself. Everything runs on your own machine at addresses that only your computer can see (localhost).</w:t>
+        <w:t xml:space="preserve">Nothing is sent to any outside company by default. There is no account to create anywhere except inside DynamicBA itself. Everything runs on your own machine at addresses that only your computer can see (localhost). The one optional exception is described in Section 7: if you choose to turn on AI-generated draft specs, DynamicBA sends that project's Statement of Work to Anthropic's API to draft the specs — nothing else, and only if you set that up yourself.</w:t>
       </w:r>
     </w:p>
     <w:p>
@@ -362,6 +414,11 @@
       </w:r>
     </w:p>
     <w:p>
+      <w:r>
+        <w:br w:type="page"/>
+      </w:r>
+    </w:p>
+    <w:p>
       <w:pPr>
         <w:pStyle w:val="Heading1"/>
       </w:pPr>
@@ -382,7 +439,7 @@
         <w:pStyle w:val="ListParagraph"/>
         <w:numPr>
           <w:ilvl w:val="0"/>
-          <w:numId w:val="2"/>
+          <w:numId w:val="1"/>
         </w:numPr>
         <w:spacing w:after="100"/>
       </w:pPr>
@@ -401,7 +458,7 @@
         <w:pStyle w:val="ListParagraph"/>
         <w:numPr>
           <w:ilvl w:val="0"/>
-          <w:numId w:val="2"/>
+          <w:numId w:val="1"/>
         </w:numPr>
         <w:spacing w:after="100"/>
       </w:pPr>
@@ -420,7 +477,7 @@
         <w:pStyle w:val="ListParagraph"/>
         <w:numPr>
           <w:ilvl w:val="0"/>
-          <w:numId w:val="2"/>
+          <w:numId w:val="1"/>
         </w:numPr>
         <w:spacing w:after="100"/>
       </w:pPr>
@@ -455,7 +512,7 @@
         <w:pStyle w:val="ListParagraph"/>
         <w:numPr>
           <w:ilvl w:val="0"/>
-          <w:numId w:val="3"/>
+          <w:numId w:val="1"/>
         </w:numPr>
         <w:spacing w:after="100"/>
       </w:pPr>
@@ -474,7 +531,7 @@
         <w:pStyle w:val="ListParagraph"/>
         <w:numPr>
           <w:ilvl w:val="0"/>
-          <w:numId w:val="3"/>
+          <w:numId w:val="1"/>
         </w:numPr>
         <w:spacing w:after="100"/>
       </w:pPr>
@@ -493,7 +550,7 @@
         <w:pStyle w:val="ListParagraph"/>
         <w:numPr>
           <w:ilvl w:val="0"/>
-          <w:numId w:val="2"/>
+          <w:numId w:val="1"/>
         </w:numPr>
         <w:spacing w:after="100"/>
       </w:pPr>
@@ -512,7 +569,7 @@
         <w:pStyle w:val="ListParagraph"/>
         <w:numPr>
           <w:ilvl w:val="0"/>
-          <w:numId w:val="2"/>
+          <w:numId w:val="1"/>
         </w:numPr>
         <w:spacing w:after="100"/>
       </w:pPr>
@@ -531,7 +588,7 @@
         <w:pStyle w:val="ListParagraph"/>
         <w:numPr>
           <w:ilvl w:val="0"/>
-          <w:numId w:val="3"/>
+          <w:numId w:val="1"/>
         </w:numPr>
         <w:spacing w:after="100"/>
       </w:pPr>
@@ -550,7 +607,7 @@
         <w:pStyle w:val="ListParagraph"/>
         <w:numPr>
           <w:ilvl w:val="0"/>
-          <w:numId w:val="3"/>
+          <w:numId w:val="1"/>
         </w:numPr>
         <w:spacing w:after="100"/>
       </w:pPr>
@@ -562,6 +619,11 @@
           <w:szCs w:val="24"/>
         </w:rPr>
         <w:t xml:space="preserve">Close and reopen your Terminal, then type node -v again to confirm it now shows a version number.</w:t>
+      </w:r>
+    </w:p>
+    <w:p>
+      <w:r>
+        <w:br w:type="page"/>
       </w:r>
     </w:p>
     <w:p>
@@ -604,7 +666,7 @@
         <w:pStyle w:val="ListParagraph"/>
         <w:numPr>
           <w:ilvl w:val="0"/>
-          <w:numId w:val="3"/>
+          <w:numId w:val="1"/>
         </w:numPr>
         <w:spacing w:after="100"/>
       </w:pPr>
@@ -623,75 +685,129 @@
         <w:pStyle w:val="ListParagraph"/>
         <w:numPr>
           <w:ilvl w:val="0"/>
-          <w:numId w:val="3"/>
-        </w:numPr>
-        <w:spacing w:after="100"/>
-      </w:pPr>
-      <w:r>
-        <w:rPr>
-          <w:rFonts w:ascii="Times New Roman" w:cs="Times New Roman" w:eastAsia="Times New Roman" w:hAnsi="Times New Roman"/>
-          <w:color w:val="58595B"/>
-          <w:sz w:val="24"/>
-          <w:szCs w:val="24"/>
-        </w:rPr>
-        <w:t xml:space="preserve">Navigate into the server folder inside the application folder you unzipped. For example, if you unzipped DynamicBA to your Desktop, type:</w:t>
-      </w:r>
-    </w:p>
-    <w:p>
-      <w:pPr>
-        <w:spacing w:after="160" w:line="276"/>
-        <w:jc w:val="both"/>
-      </w:pPr>
-      <w:r>
-        <w:rPr>
-          <w:rFonts w:ascii="Times New Roman" w:cs="Times New Roman" w:eastAsia="Times New Roman" w:hAnsi="Times New Roman"/>
-          <w:b w:val="false"/>
-          <w:bCs w:val="false"/>
-          <w:i/>
-          <w:iCs/>
-          <w:color w:val="58595B"/>
-          <w:sz w:val="24"/>
-          <w:szCs w:val="24"/>
-        </w:rPr>
-        <w:t xml:space="preserve">cd Desktop/dynamicba/server</w:t>
-      </w:r>
-    </w:p>
-    <w:p>
-      <w:pPr>
-        <w:pStyle w:val="ListParagraph"/>
-        <w:numPr>
-          <w:ilvl w:val="0"/>
-          <w:numId w:val="3"/>
-        </w:numPr>
-        <w:spacing w:after="100"/>
-      </w:pPr>
-      <w:r>
-        <w:rPr>
-          <w:rFonts w:ascii="Times New Roman" w:cs="Times New Roman" w:eastAsia="Times New Roman" w:hAnsi="Times New Roman"/>
-          <w:color w:val="58595B"/>
-          <w:sz w:val="24"/>
-          <w:szCs w:val="24"/>
-        </w:rPr>
-        <w:t xml:space="preserve">Install the Server’s components (only needed the first time):</w:t>
-      </w:r>
-    </w:p>
-    <w:p>
-      <w:pPr>
-        <w:spacing w:after="160" w:line="276"/>
-        <w:jc w:val="both"/>
-      </w:pPr>
-      <w:r>
-        <w:rPr>
-          <w:rFonts w:ascii="Times New Roman" w:cs="Times New Roman" w:eastAsia="Times New Roman" w:hAnsi="Times New Roman"/>
-          <w:b w:val="false"/>
-          <w:bCs w:val="false"/>
-          <w:i/>
-          <w:iCs/>
-          <w:color w:val="58595B"/>
-          <w:sz w:val="24"/>
-          <w:szCs w:val="24"/>
-        </w:rPr>
-        <w:t xml:space="preserve">npm install</w:t>
+          <w:numId w:val="1"/>
+        </w:numPr>
+        <w:spacing w:after="100"/>
+      </w:pPr>
+      <w:r>
+        <w:rPr>
+          <w:rFonts w:ascii="Times New Roman" w:cs="Times New Roman" w:eastAsia="Times New Roman" w:hAnsi="Times New Roman"/>
+          <w:color w:val="58595B"/>
+          <w:sz w:val="24"/>
+          <w:szCs w:val="24"/>
+        </w:rPr>
+        <w:t xml:space="preserve">Navigate into the server folder inside the application folder you unzipped. For example, if you unzipped DynamicBA to your Desktop, type: cd Desktop/dynamicba/server</w:t>
+      </w:r>
+    </w:p>
+    <w:p>
+      <w:pPr>
+        <w:pStyle w:val="ListParagraph"/>
+        <w:numPr>
+          <w:ilvl w:val="0"/>
+          <w:numId w:val="1"/>
+        </w:numPr>
+        <w:spacing w:after="100"/>
+      </w:pPr>
+      <w:r>
+        <w:rPr>
+          <w:rFonts w:ascii="Times New Roman" w:cs="Times New Roman" w:eastAsia="Times New Roman" w:hAnsi="Times New Roman"/>
+          <w:color w:val="58595B"/>
+          <w:sz w:val="24"/>
+          <w:szCs w:val="24"/>
+        </w:rPr>
+        <w:t xml:space="preserve">Install the Server's components (only needed the first time): npm install — this takes a minute or two. You will see a lot of text scroll by — that is normal.</w:t>
+      </w:r>
+    </w:p>
+    <w:p>
+      <w:pPr>
+        <w:pStyle w:val="ListParagraph"/>
+        <w:numPr>
+          <w:ilvl w:val="0"/>
+          <w:numId w:val="1"/>
+        </w:numPr>
+        <w:spacing w:after="100"/>
+      </w:pPr>
+      <w:r>
+        <w:rPr>
+          <w:rFonts w:ascii="Times New Roman" w:cs="Times New Roman" w:eastAsia="Times New Roman" w:hAnsi="Times New Roman"/>
+          <w:color w:val="58595B"/>
+          <w:sz w:val="24"/>
+          <w:szCs w:val="24"/>
+        </w:rPr>
+        <w:t xml:space="preserve">Make a copy of the settings file (only needed the first time). Mac/Linux: cp .env.example .env — Windows: copy .env.example .env</w:t>
+      </w:r>
+    </w:p>
+    <w:p>
+      <w:pPr>
+        <w:pStyle w:val="ListParagraph"/>
+        <w:numPr>
+          <w:ilvl w:val="0"/>
+          <w:numId w:val="1"/>
+        </w:numPr>
+        <w:spacing w:after="100"/>
+      </w:pPr>
+      <w:r>
+        <w:rPr>
+          <w:rFonts w:ascii="Times New Roman" w:cs="Times New Roman" w:eastAsia="Times New Roman" w:hAnsi="Times New Roman"/>
+          <w:color w:val="58595B"/>
+          <w:sz w:val="24"/>
+          <w:szCs w:val="24"/>
+        </w:rPr>
+        <w:t xml:space="preserve">(Optional, but recommended) Load DynamicBA with five example clients and ten example engagements so there is something to explore right away: npm run seed — this also creates a ready-to-use login: email admin@dynamicba.demo, password DemoAdmin123!</w:t>
+      </w:r>
+    </w:p>
+    <w:p>
+      <w:pPr>
+        <w:pStyle w:val="ListParagraph"/>
+        <w:numPr>
+          <w:ilvl w:val="0"/>
+          <w:numId w:val="1"/>
+        </w:numPr>
+        <w:spacing w:after="100"/>
+      </w:pPr>
+      <w:r>
+        <w:rPr>
+          <w:rFonts w:ascii="Times New Roman" w:cs="Times New Roman" w:eastAsia="Times New Roman" w:hAnsi="Times New Roman"/>
+          <w:color w:val="58595B"/>
+          <w:sz w:val="24"/>
+          <w:szCs w:val="24"/>
+        </w:rPr>
+        <w:t xml:space="preserve">Start the Server: npm run dev</w:t>
+      </w:r>
+    </w:p>
+    <w:p>
+      <w:pPr>
+        <w:pStyle w:val="ListParagraph"/>
+        <w:numPr>
+          <w:ilvl w:val="0"/>
+          <w:numId w:val="1"/>
+        </w:numPr>
+        <w:spacing w:after="100"/>
+      </w:pPr>
+      <w:r>
+        <w:rPr>
+          <w:rFonts w:ascii="Times New Roman" w:cs="Times New Roman" w:eastAsia="Times New Roman" w:hAnsi="Times New Roman"/>
+          <w:color w:val="58595B"/>
+          <w:sz w:val="24"/>
+          <w:szCs w:val="24"/>
+        </w:rPr>
+        <w:t xml:space="preserve">You should see a line saying "DynamicBA API server listening on http://localhost:4000" — leave this window open.</w:t>
+      </w:r>
+    </w:p>
+    <w:p>
+      <w:pPr>
+        <w:pStyle w:val="Heading1"/>
+      </w:pPr>
+      <w:r>
+        <w:rPr>
+          <w:rFonts w:ascii="Times New Roman" w:cs="Times New Roman" w:eastAsia="Times New Roman" w:hAnsi="Times New Roman"/>
+          <w:b/>
+          <w:bCs/>
+          <w:color w:val="E07B00"/>
+          <w:sz w:val="34"/>
+          <w:szCs w:val="34"/>
+        </w:rPr>
+        <w:t xml:space="preserve">5. Step 3 — Start the Web App</w:t>
       </w:r>
     </w:p>
     <w:p>
@@ -710,102 +826,199 @@
           <w:sz w:val="24"/>
           <w:szCs w:val="24"/>
         </w:rPr>
-        <w:t xml:space="preserve">This takes a minute or two. You will see a lot of text scroll by — that is normal.</w:t>
-      </w:r>
-    </w:p>
-    <w:p>
-      <w:pPr>
-        <w:pStyle w:val="ListParagraph"/>
-        <w:numPr>
-          <w:ilvl w:val="0"/>
-          <w:numId w:val="3"/>
-        </w:numPr>
-        <w:spacing w:after="100"/>
-      </w:pPr>
-      <w:r>
-        <w:rPr>
-          <w:rFonts w:ascii="Times New Roman" w:cs="Times New Roman" w:eastAsia="Times New Roman" w:hAnsi="Times New Roman"/>
-          <w:color w:val="58595B"/>
-          <w:sz w:val="24"/>
-          <w:szCs w:val="24"/>
-        </w:rPr>
-        <w:t xml:space="preserve">Make a copy of the settings file (only needed the first time). Type:</w:t>
-      </w:r>
-    </w:p>
-    <w:p>
-      <w:pPr>
-        <w:spacing w:after="160" w:line="276"/>
-        <w:jc w:val="both"/>
-      </w:pPr>
-      <w:r>
-        <w:rPr>
-          <w:rFonts w:ascii="Times New Roman" w:cs="Times New Roman" w:eastAsia="Times New Roman" w:hAnsi="Times New Roman"/>
-          <w:b w:val="false"/>
-          <w:bCs w:val="false"/>
-          <w:i/>
-          <w:iCs/>
-          <w:color w:val="58595B"/>
-          <w:sz w:val="24"/>
-          <w:szCs w:val="24"/>
-        </w:rPr>
-        <w:t xml:space="preserve">Mac / Linux:  cp .env.example .env</w:t>
-      </w:r>
-    </w:p>
-    <w:p>
-      <w:pPr>
-        <w:spacing w:after="160" w:line="276"/>
-        <w:jc w:val="both"/>
-      </w:pPr>
-      <w:r>
-        <w:rPr>
-          <w:rFonts w:ascii="Times New Roman" w:cs="Times New Roman" w:eastAsia="Times New Roman" w:hAnsi="Times New Roman"/>
-          <w:b w:val="false"/>
-          <w:bCs w:val="false"/>
-          <w:i/>
-          <w:iCs/>
-          <w:color w:val="58595B"/>
-          <w:sz w:val="24"/>
-          <w:szCs w:val="24"/>
-        </w:rPr>
-        <w:t xml:space="preserve">Windows:  copy .env.example .env</w:t>
-      </w:r>
-    </w:p>
-    <w:p>
-      <w:pPr>
-        <w:pStyle w:val="ListParagraph"/>
-        <w:numPr>
-          <w:ilvl w:val="0"/>
-          <w:numId w:val="3"/>
-        </w:numPr>
-        <w:spacing w:after="100"/>
-      </w:pPr>
-      <w:r>
-        <w:rPr>
-          <w:rFonts w:ascii="Times New Roman" w:cs="Times New Roman" w:eastAsia="Times New Roman" w:hAnsi="Times New Roman"/>
-          <w:color w:val="58595B"/>
-          <w:sz w:val="24"/>
-          <w:szCs w:val="24"/>
-        </w:rPr>
-        <w:t xml:space="preserve">(Optional, but recommended) Load DynamicBA with five example clients and ten example engagements so there is something to explore right away:</w:t>
-      </w:r>
-    </w:p>
-    <w:p>
-      <w:pPr>
-        <w:spacing w:after="160" w:line="276"/>
-        <w:jc w:val="both"/>
-      </w:pPr>
-      <w:r>
-        <w:rPr>
-          <w:rFonts w:ascii="Times New Roman" w:cs="Times New Roman" w:eastAsia="Times New Roman" w:hAnsi="Times New Roman"/>
-          <w:b w:val="false"/>
-          <w:bCs w:val="false"/>
-          <w:i/>
-          <w:iCs/>
-          <w:color w:val="58595B"/>
-          <w:sz w:val="24"/>
-          <w:szCs w:val="24"/>
-        </w:rPr>
-        <w:t xml:space="preserve">npm run seed</w:t>
+        <w:t xml:space="preserve">Now open a second, separate Terminal window (leave the first one running) for the part you actually see and click.</w:t>
+      </w:r>
+    </w:p>
+    <w:p>
+      <w:pPr>
+        <w:pStyle w:val="ListParagraph"/>
+        <w:numPr>
+          <w:ilvl w:val="0"/>
+          <w:numId w:val="1"/>
+        </w:numPr>
+        <w:spacing w:after="100"/>
+      </w:pPr>
+      <w:r>
+        <w:rPr>
+          <w:rFonts w:ascii="Times New Roman" w:cs="Times New Roman" w:eastAsia="Times New Roman" w:hAnsi="Times New Roman"/>
+          <w:color w:val="58595B"/>
+          <w:sz w:val="24"/>
+          <w:szCs w:val="24"/>
+        </w:rPr>
+        <w:t xml:space="preserve">Open a new Terminal window.</w:t>
+      </w:r>
+    </w:p>
+    <w:p>
+      <w:pPr>
+        <w:pStyle w:val="ListParagraph"/>
+        <w:numPr>
+          <w:ilvl w:val="0"/>
+          <w:numId w:val="1"/>
+        </w:numPr>
+        <w:spacing w:after="100"/>
+      </w:pPr>
+      <w:r>
+        <w:rPr>
+          <w:rFonts w:ascii="Times New Roman" w:cs="Times New Roman" w:eastAsia="Times New Roman" w:hAnsi="Times New Roman"/>
+          <w:color w:val="58595B"/>
+          <w:sz w:val="24"/>
+          <w:szCs w:val="24"/>
+        </w:rPr>
+        <w:t xml:space="preserve">Navigate into the web folder in the same application folder. For example: cd Desktop/dynamicba/web</w:t>
+      </w:r>
+    </w:p>
+    <w:p>
+      <w:pPr>
+        <w:pStyle w:val="ListParagraph"/>
+        <w:numPr>
+          <w:ilvl w:val="0"/>
+          <w:numId w:val="1"/>
+        </w:numPr>
+        <w:spacing w:after="100"/>
+      </w:pPr>
+      <w:r>
+        <w:rPr>
+          <w:rFonts w:ascii="Times New Roman" w:cs="Times New Roman" w:eastAsia="Times New Roman" w:hAnsi="Times New Roman"/>
+          <w:color w:val="58595B"/>
+          <w:sz w:val="24"/>
+          <w:szCs w:val="24"/>
+        </w:rPr>
+        <w:t xml:space="preserve">Install the Web App's components (only needed the first time): npm install</w:t>
+      </w:r>
+    </w:p>
+    <w:p>
+      <w:pPr>
+        <w:pStyle w:val="ListParagraph"/>
+        <w:numPr>
+          <w:ilvl w:val="0"/>
+          <w:numId w:val="1"/>
+        </w:numPr>
+        <w:spacing w:after="100"/>
+      </w:pPr>
+      <w:r>
+        <w:rPr>
+          <w:rFonts w:ascii="Times New Roman" w:cs="Times New Roman" w:eastAsia="Times New Roman" w:hAnsi="Times New Roman"/>
+          <w:color w:val="58595B"/>
+          <w:sz w:val="24"/>
+          <w:szCs w:val="24"/>
+        </w:rPr>
+        <w:t xml:space="preserve">Start the Web App: npm run dev</w:t>
+      </w:r>
+    </w:p>
+    <w:p>
+      <w:pPr>
+        <w:pStyle w:val="ListParagraph"/>
+        <w:numPr>
+          <w:ilvl w:val="0"/>
+          <w:numId w:val="1"/>
+        </w:numPr>
+        <w:spacing w:after="100"/>
+      </w:pPr>
+      <w:r>
+        <w:rPr>
+          <w:rFonts w:ascii="Times New Roman" w:cs="Times New Roman" w:eastAsia="Times New Roman" w:hAnsi="Times New Roman"/>
+          <w:color w:val="58595B"/>
+          <w:sz w:val="24"/>
+          <w:szCs w:val="24"/>
+        </w:rPr>
+        <w:t xml:space="preserve">You should see a line with a web address, typically http://localhost:5173 — leave this window open too.</w:t>
+      </w:r>
+    </w:p>
+    <w:p>
+      <w:r>
+        <w:br w:type="page"/>
+      </w:r>
+    </w:p>
+    <w:p>
+      <w:pPr>
+        <w:pStyle w:val="Heading1"/>
+      </w:pPr>
+      <w:r>
+        <w:rPr>
+          <w:rFonts w:ascii="Times New Roman" w:cs="Times New Roman" w:eastAsia="Times New Roman" w:hAnsi="Times New Roman"/>
+          <w:b/>
+          <w:bCs/>
+          <w:color w:val="E07B00"/>
+          <w:sz w:val="34"/>
+          <w:szCs w:val="34"/>
+        </w:rPr>
+        <w:t xml:space="preserve">6. Step 4 — Open DynamicBA in Your Browser</w:t>
+      </w:r>
+    </w:p>
+    <w:p>
+      <w:pPr>
+        <w:pStyle w:val="ListParagraph"/>
+        <w:numPr>
+          <w:ilvl w:val="0"/>
+          <w:numId w:val="1"/>
+        </w:numPr>
+        <w:spacing w:after="100"/>
+      </w:pPr>
+      <w:r>
+        <w:rPr>
+          <w:rFonts w:ascii="Times New Roman" w:cs="Times New Roman" w:eastAsia="Times New Roman" w:hAnsi="Times New Roman"/>
+          <w:color w:val="58595B"/>
+          <w:sz w:val="24"/>
+          <w:szCs w:val="24"/>
+        </w:rPr>
+        <w:t xml:space="preserve">Open your web browser (Chrome, Edge, or Firefox).</w:t>
+      </w:r>
+    </w:p>
+    <w:p>
+      <w:pPr>
+        <w:pStyle w:val="ListParagraph"/>
+        <w:numPr>
+          <w:ilvl w:val="0"/>
+          <w:numId w:val="1"/>
+        </w:numPr>
+        <w:spacing w:after="100"/>
+      </w:pPr>
+      <w:r>
+        <w:rPr>
+          <w:rFonts w:ascii="Times New Roman" w:cs="Times New Roman" w:eastAsia="Times New Roman" w:hAnsi="Times New Roman"/>
+          <w:color w:val="58595B"/>
+          <w:sz w:val="24"/>
+          <w:szCs w:val="24"/>
+        </w:rPr>
+        <w:t xml:space="preserve">Go to the address shown in the second Terminal window — usually http://localhost:5173</w:t>
+      </w:r>
+    </w:p>
+    <w:p>
+      <w:pPr>
+        <w:pStyle w:val="ListParagraph"/>
+        <w:numPr>
+          <w:ilvl w:val="0"/>
+          <w:numId w:val="1"/>
+        </w:numPr>
+        <w:spacing w:after="100"/>
+      </w:pPr>
+      <w:r>
+        <w:rPr>
+          <w:rFonts w:ascii="Times New Roman" w:cs="Times New Roman" w:eastAsia="Times New Roman" w:hAnsi="Times New Roman"/>
+          <w:color w:val="58595B"/>
+          <w:sz w:val="24"/>
+          <w:szCs w:val="24"/>
+        </w:rPr>
+        <w:t xml:space="preserve">If you ran npm run seed in Step 2, sign in with email admin@dynamicba.demo and password DemoAdmin123!</w:t>
+      </w:r>
+    </w:p>
+    <w:p>
+      <w:pPr>
+        <w:pStyle w:val="ListParagraph"/>
+        <w:numPr>
+          <w:ilvl w:val="0"/>
+          <w:numId w:val="1"/>
+        </w:numPr>
+        <w:spacing w:after="100"/>
+      </w:pPr>
+      <w:r>
+        <w:rPr>
+          <w:rFonts w:ascii="Times New Roman" w:cs="Times New Roman" w:eastAsia="Times New Roman" w:hAnsi="Times New Roman"/>
+          <w:color w:val="58595B"/>
+          <w:sz w:val="24"/>
+          <w:szCs w:val="24"/>
+        </w:rPr>
+        <w:t xml:space="preserve">Otherwise, click "Create one" and follow the on-screen steps to set up your own account and consulting firm.</w:t>
       </w:r>
     </w:p>
     <w:p>
@@ -824,64 +1037,7 @@
           <w:sz w:val="24"/>
           <w:szCs w:val="24"/>
         </w:rPr>
-        <w:t xml:space="preserve">This also creates a ready-to-use login: email admin@dynamicba.demo, password DemoAdmin123!</w:t>
-      </w:r>
-    </w:p>
-    <w:p>
-      <w:pPr>
-        <w:pStyle w:val="ListParagraph"/>
-        <w:numPr>
-          <w:ilvl w:val="0"/>
-          <w:numId w:val="3"/>
-        </w:numPr>
-        <w:spacing w:after="100"/>
-      </w:pPr>
-      <w:r>
-        <w:rPr>
-          <w:rFonts w:ascii="Times New Roman" w:cs="Times New Roman" w:eastAsia="Times New Roman" w:hAnsi="Times New Roman"/>
-          <w:color w:val="58595B"/>
-          <w:sz w:val="24"/>
-          <w:szCs w:val="24"/>
-        </w:rPr>
-        <w:t xml:space="preserve">Start the Server:</w:t>
-      </w:r>
-    </w:p>
-    <w:p>
-      <w:pPr>
-        <w:spacing w:after="160" w:line="276"/>
-        <w:jc w:val="both"/>
-      </w:pPr>
-      <w:r>
-        <w:rPr>
-          <w:rFonts w:ascii="Times New Roman" w:cs="Times New Roman" w:eastAsia="Times New Roman" w:hAnsi="Times New Roman"/>
-          <w:b w:val="false"/>
-          <w:bCs w:val="false"/>
-          <w:i/>
-          <w:iCs/>
-          <w:color w:val="58595B"/>
-          <w:sz w:val="24"/>
-          <w:szCs w:val="24"/>
-        </w:rPr>
-        <w:t xml:space="preserve">npm run dev</w:t>
-      </w:r>
-    </w:p>
-    <w:p>
-      <w:pPr>
-        <w:pStyle w:val="ListParagraph"/>
-        <w:numPr>
-          <w:ilvl w:val="0"/>
-          <w:numId w:val="3"/>
-        </w:numPr>
-        <w:spacing w:after="100"/>
-      </w:pPr>
-      <w:r>
-        <w:rPr>
-          <w:rFonts w:ascii="Times New Roman" w:cs="Times New Roman" w:eastAsia="Times New Roman" w:hAnsi="Times New Roman"/>
-          <w:color w:val="58595B"/>
-          <w:sz w:val="24"/>
-          <w:szCs w:val="24"/>
-        </w:rPr>
-        <w:t xml:space="preserve">You should see a line saying DynamicBA API server listening on http://localhost:4000 — leave this window open.</w:t>
+        <w:t xml:space="preserve">You now have DynamicBA fully running on your own computer. The companion DynamicBA User Guide walks through every screen.</w:t>
       </w:r>
     </w:p>
     <w:p>
@@ -897,7 +1053,7 @@
           <w:sz w:val="34"/>
           <w:szCs w:val="34"/>
         </w:rPr>
-        <w:t xml:space="preserve">5. Step 3 — Start the Web App</w:t>
+        <w:t xml:space="preserve">7. Optional — Enable AI-Generated Draft Specs</w:t>
       </w:r>
     </w:p>
     <w:p>
@@ -916,251 +1072,83 @@
           <w:sz w:val="24"/>
           <w:szCs w:val="24"/>
         </w:rPr>
-        <w:t xml:space="preserve">Now open a second, separate Terminal window (leave the first one running) for the part you actually see and click.</w:t>
-      </w:r>
-    </w:p>
-    <w:p>
-      <w:pPr>
-        <w:pStyle w:val="ListParagraph"/>
-        <w:numPr>
-          <w:ilvl w:val="0"/>
-          <w:numId w:val="3"/>
-        </w:numPr>
-        <w:spacing w:after="100"/>
-      </w:pPr>
-      <w:r>
-        <w:rPr>
-          <w:rFonts w:ascii="Times New Roman" w:cs="Times New Roman" w:eastAsia="Times New Roman" w:hAnsi="Times New Roman"/>
-          <w:color w:val="58595B"/>
-          <w:sz w:val="24"/>
-          <w:szCs w:val="24"/>
-        </w:rPr>
-        <w:t xml:space="preserve">Open a new Terminal window.</w:t>
-      </w:r>
-    </w:p>
-    <w:p>
-      <w:pPr>
-        <w:pStyle w:val="ListParagraph"/>
-        <w:numPr>
-          <w:ilvl w:val="0"/>
-          <w:numId w:val="3"/>
-        </w:numPr>
-        <w:spacing w:after="100"/>
-      </w:pPr>
-      <w:r>
-        <w:rPr>
-          <w:rFonts w:ascii="Times New Roman" w:cs="Times New Roman" w:eastAsia="Times New Roman" w:hAnsi="Times New Roman"/>
-          <w:color w:val="58595B"/>
-          <w:sz w:val="24"/>
-          <w:szCs w:val="24"/>
-        </w:rPr>
-        <w:t xml:space="preserve">Navigate into the web folder in the same application folder. For example:</w:t>
-      </w:r>
-    </w:p>
-    <w:p>
-      <w:pPr>
-        <w:spacing w:after="160" w:line="276"/>
-        <w:jc w:val="both"/>
-      </w:pPr>
-      <w:r>
-        <w:rPr>
-          <w:rFonts w:ascii="Times New Roman" w:cs="Times New Roman" w:eastAsia="Times New Roman" w:hAnsi="Times New Roman"/>
-          <w:b w:val="false"/>
-          <w:bCs w:val="false"/>
-          <w:i/>
-          <w:iCs/>
-          <w:color w:val="58595B"/>
-          <w:sz w:val="24"/>
-          <w:szCs w:val="24"/>
-        </w:rPr>
-        <w:t xml:space="preserve">cd Desktop/dynamicba/web</w:t>
-      </w:r>
-    </w:p>
-    <w:p>
-      <w:pPr>
-        <w:pStyle w:val="ListParagraph"/>
-        <w:numPr>
-          <w:ilvl w:val="0"/>
-          <w:numId w:val="3"/>
-        </w:numPr>
-        <w:spacing w:after="100"/>
-      </w:pPr>
-      <w:r>
-        <w:rPr>
-          <w:rFonts w:ascii="Times New Roman" w:cs="Times New Roman" w:eastAsia="Times New Roman" w:hAnsi="Times New Roman"/>
-          <w:color w:val="58595B"/>
-          <w:sz w:val="24"/>
-          <w:szCs w:val="24"/>
-        </w:rPr>
-        <w:t xml:space="preserve">Install the Web App’s components (only needed the first time):</w:t>
-      </w:r>
-    </w:p>
-    <w:p>
-      <w:pPr>
-        <w:spacing w:after="160" w:line="276"/>
-        <w:jc w:val="both"/>
-      </w:pPr>
-      <w:r>
-        <w:rPr>
-          <w:rFonts w:ascii="Times New Roman" w:cs="Times New Roman" w:eastAsia="Times New Roman" w:hAnsi="Times New Roman"/>
-          <w:b w:val="false"/>
-          <w:bCs w:val="false"/>
-          <w:i/>
-          <w:iCs/>
-          <w:color w:val="58595B"/>
-          <w:sz w:val="24"/>
-          <w:szCs w:val="24"/>
-        </w:rPr>
-        <w:t xml:space="preserve">npm install</w:t>
-      </w:r>
-    </w:p>
-    <w:p>
-      <w:pPr>
-        <w:pStyle w:val="ListParagraph"/>
-        <w:numPr>
-          <w:ilvl w:val="0"/>
-          <w:numId w:val="3"/>
-        </w:numPr>
-        <w:spacing w:after="100"/>
-      </w:pPr>
-      <w:r>
-        <w:rPr>
-          <w:rFonts w:ascii="Times New Roman" w:cs="Times New Roman" w:eastAsia="Times New Roman" w:hAnsi="Times New Roman"/>
-          <w:color w:val="58595B"/>
-          <w:sz w:val="24"/>
-          <w:szCs w:val="24"/>
-        </w:rPr>
-        <w:t xml:space="preserve">Start the Web App:</w:t>
-      </w:r>
-    </w:p>
-    <w:p>
-      <w:pPr>
-        <w:spacing w:after="160" w:line="276"/>
-        <w:jc w:val="both"/>
-      </w:pPr>
-      <w:r>
-        <w:rPr>
-          <w:rFonts w:ascii="Times New Roman" w:cs="Times New Roman" w:eastAsia="Times New Roman" w:hAnsi="Times New Roman"/>
-          <w:b w:val="false"/>
-          <w:bCs w:val="false"/>
-          <w:i/>
-          <w:iCs/>
-          <w:color w:val="58595B"/>
-          <w:sz w:val="24"/>
-          <w:szCs w:val="24"/>
-        </w:rPr>
-        <w:t xml:space="preserve">npm run dev</w:t>
-      </w:r>
-    </w:p>
-    <w:p>
-      <w:pPr>
-        <w:pStyle w:val="ListParagraph"/>
-        <w:numPr>
-          <w:ilvl w:val="0"/>
-          <w:numId w:val="3"/>
-        </w:numPr>
-        <w:spacing w:after="100"/>
-      </w:pPr>
-      <w:r>
-        <w:rPr>
-          <w:rFonts w:ascii="Times New Roman" w:cs="Times New Roman" w:eastAsia="Times New Roman" w:hAnsi="Times New Roman"/>
-          <w:color w:val="58595B"/>
-          <w:sz w:val="24"/>
-          <w:szCs w:val="24"/>
-        </w:rPr>
-        <w:t xml:space="preserve">You should see a line with a web address, typically http://localhost:5173 — leave this window open too.</w:t>
-      </w:r>
-    </w:p>
-    <w:p>
-      <w:pPr>
-        <w:pStyle w:val="Heading1"/>
-      </w:pPr>
-      <w:r>
-        <w:rPr>
-          <w:rFonts w:ascii="Times New Roman" w:cs="Times New Roman" w:eastAsia="Times New Roman" w:hAnsi="Times New Roman"/>
-          <w:b/>
-          <w:bCs/>
-          <w:color w:val="E07B00"/>
-          <w:sz w:val="34"/>
-          <w:szCs w:val="34"/>
-        </w:rPr>
-        <w:t xml:space="preserve">6. Step 4 — Open DynamicBA in Your Browser</w:t>
-      </w:r>
-    </w:p>
-    <w:p>
-      <w:pPr>
-        <w:pStyle w:val="ListParagraph"/>
-        <w:numPr>
-          <w:ilvl w:val="0"/>
-          <w:numId w:val="3"/>
-        </w:numPr>
-        <w:spacing w:after="100"/>
-      </w:pPr>
-      <w:r>
-        <w:rPr>
-          <w:rFonts w:ascii="Times New Roman" w:cs="Times New Roman" w:eastAsia="Times New Roman" w:hAnsi="Times New Roman"/>
-          <w:color w:val="58595B"/>
-          <w:sz w:val="24"/>
-          <w:szCs w:val="24"/>
-        </w:rPr>
-        <w:t xml:space="preserve">Open your web browser (Chrome, Edge, or Firefox).</w:t>
-      </w:r>
-    </w:p>
-    <w:p>
-      <w:pPr>
-        <w:pStyle w:val="ListParagraph"/>
-        <w:numPr>
-          <w:ilvl w:val="0"/>
-          <w:numId w:val="3"/>
-        </w:numPr>
-        <w:spacing w:after="100"/>
-      </w:pPr>
-      <w:r>
-        <w:rPr>
-          <w:rFonts w:ascii="Times New Roman" w:cs="Times New Roman" w:eastAsia="Times New Roman" w:hAnsi="Times New Roman"/>
-          <w:color w:val="58595B"/>
-          <w:sz w:val="24"/>
-          <w:szCs w:val="24"/>
-        </w:rPr>
-        <w:t xml:space="preserve">Go to the address shown in the second Terminal window — usually http://localhost:5173</w:t>
-      </w:r>
-    </w:p>
-    <w:p>
-      <w:pPr>
-        <w:pStyle w:val="ListParagraph"/>
-        <w:numPr>
-          <w:ilvl w:val="0"/>
-          <w:numId w:val="3"/>
-        </w:numPr>
-        <w:spacing w:after="100"/>
-      </w:pPr>
-      <w:r>
-        <w:rPr>
-          <w:rFonts w:ascii="Times New Roman" w:cs="Times New Roman" w:eastAsia="Times New Roman" w:hAnsi="Times New Roman"/>
-          <w:color w:val="58595B"/>
-          <w:sz w:val="24"/>
-          <w:szCs w:val="24"/>
-        </w:rPr>
-        <w:t xml:space="preserve">If you ran npm run seed in Step 2, sign in with email admin@dynamicba.demo and password DemoAdmin123!</w:t>
-      </w:r>
-    </w:p>
-    <w:p>
-      <w:pPr>
-        <w:pStyle w:val="ListParagraph"/>
-        <w:numPr>
-          <w:ilvl w:val="0"/>
-          <w:numId w:val="3"/>
-        </w:numPr>
-        <w:spacing w:after="100"/>
-      </w:pPr>
-      <w:r>
-        <w:rPr>
-          <w:rFonts w:ascii="Times New Roman" w:cs="Times New Roman" w:eastAsia="Times New Roman" w:hAnsi="Times New Roman"/>
-          <w:color w:val="58595B"/>
-          <w:sz w:val="24"/>
-          <w:szCs w:val="24"/>
-        </w:rPr>
-        <w:t xml:space="preserve">Otherwise, click "Create one" and follow the on-screen steps to set up your own account and consulting firm.</w:t>
+        <w:t xml:space="preserve">Step 2 of the engagement wizard has a "Generate Draft with AI" button that drafts automation candidates, use cases, business rules, controls, KPIs, and risks from that project's own Statement of Work, using the Anthropic (Claude) API. It is entirely optional — everything can still be typed in by hand — and takes one minute to turn on:</w:t>
+      </w:r>
+    </w:p>
+    <w:p>
+      <w:pPr>
+        <w:pStyle w:val="ListParagraph"/>
+        <w:numPr>
+          <w:ilvl w:val="0"/>
+          <w:numId w:val="1"/>
+        </w:numPr>
+        <w:spacing w:after="100"/>
+      </w:pPr>
+      <w:r>
+        <w:rPr>
+          <w:rFonts w:ascii="Times New Roman" w:cs="Times New Roman" w:eastAsia="Times New Roman" w:hAnsi="Times New Roman"/>
+          <w:color w:val="58595B"/>
+          <w:sz w:val="24"/>
+          <w:szCs w:val="24"/>
+        </w:rPr>
+        <w:t xml:space="preserve">Get a free API key at console.anthropic.com.</w:t>
+      </w:r>
+    </w:p>
+    <w:p>
+      <w:pPr>
+        <w:pStyle w:val="ListParagraph"/>
+        <w:numPr>
+          <w:ilvl w:val="0"/>
+          <w:numId w:val="1"/>
+        </w:numPr>
+        <w:spacing w:after="100"/>
+      </w:pPr>
+      <w:r>
+        <w:rPr>
+          <w:rFonts w:ascii="Times New Roman" w:cs="Times New Roman" w:eastAsia="Times New Roman" w:hAnsi="Times New Roman"/>
+          <w:color w:val="58595B"/>
+          <w:sz w:val="24"/>
+          <w:szCs w:val="24"/>
+        </w:rPr>
+        <w:t xml:space="preserve">Sign in to DynamicBA and go to Admin → AI Provider.</w:t>
+      </w:r>
+    </w:p>
+    <w:p>
+      <w:pPr>
+        <w:pStyle w:val="ListParagraph"/>
+        <w:numPr>
+          <w:ilvl w:val="0"/>
+          <w:numId w:val="1"/>
+        </w:numPr>
+        <w:spacing w:after="100"/>
+      </w:pPr>
+      <w:r>
+        <w:rPr>
+          <w:rFonts w:ascii="Times New Roman" w:cs="Times New Roman" w:eastAsia="Times New Roman" w:hAnsi="Times New Roman"/>
+          <w:color w:val="58595B"/>
+          <w:sz w:val="24"/>
+          <w:szCs w:val="24"/>
+        </w:rPr>
+        <w:t xml:space="preserve">Paste the key, choose a model (Claude Sonnet 5 is the recommended default), and click Save.</w:t>
+      </w:r>
+    </w:p>
+    <w:p>
+      <w:pPr>
+        <w:pStyle w:val="ListParagraph"/>
+        <w:numPr>
+          <w:ilvl w:val="0"/>
+          <w:numId w:val="1"/>
+        </w:numPr>
+        <w:spacing w:after="100"/>
+      </w:pPr>
+      <w:r>
+        <w:rPr>
+          <w:rFonts w:ascii="Times New Roman" w:cs="Times New Roman" w:eastAsia="Times New Roman" w:hAnsi="Times New Roman"/>
+          <w:color w:val="58595B"/>
+          <w:sz w:val="24"/>
+          <w:szCs w:val="24"/>
+        </w:rPr>
+        <w:t xml:space="preserve">Every project in your Organization can now use "Generate Draft with AI" — no restart needed.</w:t>
       </w:r>
     </w:p>
     <w:p>
@@ -1179,7 +1167,12 @@
           <w:sz w:val="24"/>
           <w:szCs w:val="24"/>
         </w:rPr>
-        <w:t xml:space="preserve">You now have DynamicBA fully running on your own computer. The companion DynamicBA User Guide walks through every screen.</w:t>
+        <w:t xml:space="preserve">The key is stored only in your own server's local data file (server/data/db.json) and is sent only to Anthropic's API to generate drafts — never anywhere else. A technical alternative: set ANTHROPIC_API_KEY in server/.env instead, which every Organization on that server will then share automatically without anyone pasting a key into the app.</w:t>
+      </w:r>
+    </w:p>
+    <w:p>
+      <w:r>
+        <w:br w:type="page"/>
       </w:r>
     </w:p>
     <w:p>
@@ -1195,7 +1188,7 @@
           <w:sz w:val="34"/>
           <w:szCs w:val="34"/>
         </w:rPr>
-        <w:t xml:space="preserve">7. Using DynamicBA Again Later</w:t>
+        <w:t xml:space="preserve">8. Using DynamicBA Again Later</w:t>
       </w:r>
     </w:p>
     <w:p>
@@ -1222,7 +1215,7 @@
         <w:pStyle w:val="ListParagraph"/>
         <w:numPr>
           <w:ilvl w:val="0"/>
-          <w:numId w:val="3"/>
+          <w:numId w:val="1"/>
         </w:numPr>
         <w:spacing w:after="100"/>
       </w:pPr>
@@ -1241,7 +1234,7 @@
         <w:pStyle w:val="ListParagraph"/>
         <w:numPr>
           <w:ilvl w:val="0"/>
-          <w:numId w:val="3"/>
+          <w:numId w:val="1"/>
         </w:numPr>
         <w:spacing w:after="100"/>
       </w:pPr>
@@ -1260,7 +1253,7 @@
         <w:pStyle w:val="ListParagraph"/>
         <w:numPr>
           <w:ilvl w:val="0"/>
-          <w:numId w:val="3"/>
+          <w:numId w:val="1"/>
         </w:numPr>
         <w:spacing w:after="100"/>
       </w:pPr>
@@ -1325,7 +1318,7 @@
           <w:sz w:val="34"/>
           <w:szCs w:val="34"/>
         </w:rPr>
-        <w:t xml:space="preserve">8. Troubleshooting</w:t>
+        <w:t xml:space="preserve">9. Troubleshooting</w:t>
       </w:r>
     </w:p>
     <w:p>
@@ -1505,6 +1498,46 @@
     </w:p>
     <w:p>
       <w:pPr>
+        <w:pStyle w:val="Heading3"/>
+      </w:pPr>
+      <w:r>
+        <w:rPr>
+          <w:rFonts w:ascii="Times New Roman" w:cs="Times New Roman" w:eastAsia="Times New Roman" w:hAnsi="Times New Roman"/>
+          <w:b/>
+          <w:bCs/>
+          <w:color w:val="E07B00"/>
+          <w:sz w:val="24"/>
+          <w:szCs w:val="24"/>
+        </w:rPr>
+        <w:t xml:space="preserve">"Generate Draft with AI" says no AI provider is configured</w:t>
+      </w:r>
+    </w:p>
+    <w:p>
+      <w:pPr>
+        <w:spacing w:after="160" w:line="276"/>
+        <w:jc w:val="both"/>
+      </w:pPr>
+      <w:r>
+        <w:rPr>
+          <w:rFonts w:ascii="Times New Roman" w:cs="Times New Roman" w:eastAsia="Times New Roman" w:hAnsi="Times New Roman"/>
+          <w:b w:val="false"/>
+          <w:bCs w:val="false"/>
+          <w:i w:val="false"/>
+          <w:iCs w:val="false"/>
+          <w:color w:val="58595B"/>
+          <w:sz w:val="24"/>
+          <w:szCs w:val="24"/>
+        </w:rPr>
+        <w:t xml:space="preserve">An Organization Admin has not set one up yet (Section 7) — this is optional, and every field can still be filled in by hand in the meantime.</w:t>
+      </w:r>
+    </w:p>
+    <w:p>
+      <w:r>
+        <w:br w:type="page"/>
+      </w:r>
+    </w:p>
+    <w:p>
+      <w:pPr>
         <w:pStyle w:val="Heading1"/>
       </w:pPr>
       <w:r>
@@ -1516,7 +1549,7 @@
           <w:sz w:val="34"/>
           <w:szCs w:val="34"/>
         </w:rPr>
-        <w:t xml:space="preserve">9. Appendix — For a Technical Deployer (Optional Reading)</w:t>
+        <w:t xml:space="preserve">10. Appendix — For a Technical Deployer (Optional Reading)</w:t>
       </w:r>
     </w:p>
     <w:p>
@@ -1551,8 +1584,8 @@
         </w:tblBorders>
       </w:tblPr>
       <w:tblGrid>
-        <w:gridCol w:w="2400"/>
-        <w:gridCol w:w="7140"/>
+        <w:gridCol w:w="2200"/>
+        <w:gridCol w:w="7340"/>
       </w:tblGrid>
       <w:tr>
         <w:trPr>
@@ -1560,20 +1593,17 @@
         </w:trPr>
         <w:tc>
           <w:tcPr>
-            <w:tcW w:type="dxa" w:w="2400"/>
+            <w:tcW w:type="dxa" w:w="2200"/>
             <w:shd w:fill="F8931D" w:color="auto" w:val="clear"/>
             <w:tcMar>
-              <w:top w:type="dxa" w:w="60"/>
+              <w:top w:type="dxa" w:w="70"/>
               <w:left w:type="dxa" w:w="100"/>
-              <w:bottom w:type="dxa" w:w="60"/>
+              <w:bottom w:type="dxa" w:w="70"/>
               <w:right w:type="dxa" w:w="100"/>
             </w:tcMar>
             <w:vAlign w:val="center"/>
           </w:tcPr>
           <w:p>
-            <w:pPr>
-              <w:jc w:val="left"/>
-            </w:pPr>
             <w:r>
               <w:rPr>
                 <w:rFonts w:ascii="Times New Roman" w:cs="Times New Roman" w:eastAsia="Times New Roman" w:hAnsi="Times New Roman"/>
@@ -1589,20 +1619,17 @@
         </w:tc>
         <w:tc>
           <w:tcPr>
-            <w:tcW w:type="dxa" w:w="7140"/>
+            <w:tcW w:type="dxa" w:w="7340"/>
             <w:shd w:fill="F8931D" w:color="auto" w:val="clear"/>
             <w:tcMar>
-              <w:top w:type="dxa" w:w="60"/>
+              <w:top w:type="dxa" w:w="70"/>
               <w:left w:type="dxa" w:w="100"/>
-              <w:bottom w:type="dxa" w:w="60"/>
+              <w:bottom w:type="dxa" w:w="70"/>
               <w:right w:type="dxa" w:w="100"/>
             </w:tcMar>
             <w:vAlign w:val="center"/>
           </w:tcPr>
           <w:p>
-            <w:pPr>
-              <w:jc w:val="left"/>
-            </w:pPr>
             <w:r>
               <w:rPr>
                 <w:rFonts w:ascii="Times New Roman" w:cs="Times New Roman" w:eastAsia="Times New Roman" w:hAnsi="Times New Roman"/>
@@ -1620,19 +1647,16 @@
       <w:tr>
         <w:tc>
           <w:tcPr>
-            <w:tcW w:type="dxa" w:w="2400"/>
+            <w:tcW w:type="dxa" w:w="2200"/>
             <w:tcMar>
-              <w:top w:type="dxa" w:w="60"/>
+              <w:top w:type="dxa" w:w="70"/>
               <w:left w:type="dxa" w:w="100"/>
-              <w:bottom w:type="dxa" w:w="60"/>
+              <w:bottom w:type="dxa" w:w="70"/>
               <w:right w:type="dxa" w:w="100"/>
             </w:tcMar>
             <w:vAlign w:val="center"/>
           </w:tcPr>
           <w:p>
-            <w:pPr>
-              <w:jc w:val="left"/>
-            </w:pPr>
             <w:r>
               <w:rPr>
                 <w:rFonts w:ascii="Times New Roman" w:cs="Times New Roman" w:eastAsia="Times New Roman" w:hAnsi="Times New Roman"/>
@@ -1648,19 +1672,16 @@
         </w:tc>
         <w:tc>
           <w:tcPr>
-            <w:tcW w:type="dxa" w:w="7140"/>
+            <w:tcW w:type="dxa" w:w="7340"/>
             <w:tcMar>
-              <w:top w:type="dxa" w:w="60"/>
+              <w:top w:type="dxa" w:w="70"/>
               <w:left w:type="dxa" w:w="100"/>
-              <w:bottom w:type="dxa" w:w="60"/>
+              <w:bottom w:type="dxa" w:w="70"/>
               <w:right w:type="dxa" w:w="100"/>
             </w:tcMar>
             <w:vAlign w:val="center"/>
           </w:tcPr>
           <w:p>
-            <w:pPr>
-              <w:jc w:val="left"/>
-            </w:pPr>
             <w:r>
               <w:rPr>
                 <w:rFonts w:ascii="Times New Roman" w:cs="Times New Roman" w:eastAsia="Times New Roman" w:hAnsi="Times New Roman"/>
@@ -1678,20 +1699,17 @@
       <w:tr>
         <w:tc>
           <w:tcPr>
-            <w:tcW w:type="dxa" w:w="2400"/>
+            <w:tcW w:type="dxa" w:w="2200"/>
             <w:shd w:fill="F2F2F3" w:color="auto" w:val="clear"/>
             <w:tcMar>
-              <w:top w:type="dxa" w:w="60"/>
+              <w:top w:type="dxa" w:w="70"/>
               <w:left w:type="dxa" w:w="100"/>
-              <w:bottom w:type="dxa" w:w="60"/>
+              <w:bottom w:type="dxa" w:w="70"/>
               <w:right w:type="dxa" w:w="100"/>
             </w:tcMar>
             <w:vAlign w:val="center"/>
           </w:tcPr>
           <w:p>
-            <w:pPr>
-              <w:jc w:val="left"/>
-            </w:pPr>
             <w:r>
               <w:rPr>
                 <w:rFonts w:ascii="Times New Roman" w:cs="Times New Roman" w:eastAsia="Times New Roman" w:hAnsi="Times New Roman"/>
@@ -1707,20 +1725,17 @@
         </w:tc>
         <w:tc>
           <w:tcPr>
-            <w:tcW w:type="dxa" w:w="7140"/>
+            <w:tcW w:type="dxa" w:w="7340"/>
             <w:shd w:fill="F2F2F3" w:color="auto" w:val="clear"/>
             <w:tcMar>
-              <w:top w:type="dxa" w:w="60"/>
+              <w:top w:type="dxa" w:w="70"/>
               <w:left w:type="dxa" w:w="100"/>
-              <w:bottom w:type="dxa" w:w="60"/>
+              <w:bottom w:type="dxa" w:w="70"/>
               <w:right w:type="dxa" w:w="100"/>
             </w:tcMar>
             <w:vAlign w:val="center"/>
           </w:tcPr>
           <w:p>
-            <w:pPr>
-              <w:jc w:val="left"/>
-            </w:pPr>
             <w:r>
               <w:rPr>
                 <w:rFonts w:ascii="Times New Roman" w:cs="Times New Roman" w:eastAsia="Times New Roman" w:hAnsi="Times New Roman"/>
@@ -1738,19 +1753,16 @@
       <w:tr>
         <w:tc>
           <w:tcPr>
-            <w:tcW w:type="dxa" w:w="2400"/>
+            <w:tcW w:type="dxa" w:w="2200"/>
             <w:tcMar>
-              <w:top w:type="dxa" w:w="60"/>
+              <w:top w:type="dxa" w:w="70"/>
               <w:left w:type="dxa" w:w="100"/>
-              <w:bottom w:type="dxa" w:w="60"/>
+              <w:bottom w:type="dxa" w:w="70"/>
               <w:right w:type="dxa" w:w="100"/>
             </w:tcMar>
             <w:vAlign w:val="center"/>
           </w:tcPr>
           <w:p>
-            <w:pPr>
-              <w:jc w:val="left"/>
-            </w:pPr>
             <w:r>
               <w:rPr>
                 <w:rFonts w:ascii="Times New Roman" w:cs="Times New Roman" w:eastAsia="Times New Roman" w:hAnsi="Times New Roman"/>
@@ -1766,19 +1778,16 @@
         </w:tc>
         <w:tc>
           <w:tcPr>
-            <w:tcW w:type="dxa" w:w="7140"/>
+            <w:tcW w:type="dxa" w:w="7340"/>
             <w:tcMar>
-              <w:top w:type="dxa" w:w="60"/>
+              <w:top w:type="dxa" w:w="70"/>
               <w:left w:type="dxa" w:w="100"/>
-              <w:bottom w:type="dxa" w:w="60"/>
+              <w:bottom w:type="dxa" w:w="70"/>
               <w:right w:type="dxa" w:w="100"/>
             </w:tcMar>
             <w:vAlign w:val="center"/>
           </w:tcPr>
           <w:p>
-            <w:pPr>
-              <w:jc w:val="left"/>
-            </w:pPr>
             <w:r>
               <w:rPr>
                 <w:rFonts w:ascii="Times New Roman" w:cs="Times New Roman" w:eastAsia="Times New Roman" w:hAnsi="Times New Roman"/>
@@ -1796,20 +1805,17 @@
       <w:tr>
         <w:tc>
           <w:tcPr>
-            <w:tcW w:type="dxa" w:w="2400"/>
+            <w:tcW w:type="dxa" w:w="2200"/>
             <w:shd w:fill="F2F2F3" w:color="auto" w:val="clear"/>
             <w:tcMar>
-              <w:top w:type="dxa" w:w="60"/>
+              <w:top w:type="dxa" w:w="70"/>
               <w:left w:type="dxa" w:w="100"/>
-              <w:bottom w:type="dxa" w:w="60"/>
+              <w:bottom w:type="dxa" w:w="70"/>
               <w:right w:type="dxa" w:w="100"/>
             </w:tcMar>
             <w:vAlign w:val="center"/>
           </w:tcPr>
           <w:p>
-            <w:pPr>
-              <w:jc w:val="left"/>
-            </w:pPr>
             <w:r>
               <w:rPr>
                 <w:rFonts w:ascii="Times New Roman" w:cs="Times New Roman" w:eastAsia="Times New Roman" w:hAnsi="Times New Roman"/>
@@ -1825,20 +1831,17 @@
         </w:tc>
         <w:tc>
           <w:tcPr>
-            <w:tcW w:type="dxa" w:w="7140"/>
+            <w:tcW w:type="dxa" w:w="7340"/>
             <w:shd w:fill="F2F2F3" w:color="auto" w:val="clear"/>
             <w:tcMar>
-              <w:top w:type="dxa" w:w="60"/>
+              <w:top w:type="dxa" w:w="70"/>
               <w:left w:type="dxa" w:w="100"/>
-              <w:bottom w:type="dxa" w:w="60"/>
+              <w:bottom w:type="dxa" w:w="70"/>
               <w:right w:type="dxa" w:w="100"/>
             </w:tcMar>
             <w:vAlign w:val="center"/>
           </w:tcPr>
           <w:p>
-            <w:pPr>
-              <w:jc w:val="left"/>
-            </w:pPr>
             <w:r>
               <w:rPr>
                 <w:rFonts w:ascii="Times New Roman" w:cs="Times New Roman" w:eastAsia="Times New Roman" w:hAnsi="Times New Roman"/>
@@ -1856,19 +1859,16 @@
       <w:tr>
         <w:tc>
           <w:tcPr>
-            <w:tcW w:type="dxa" w:w="2400"/>
+            <w:tcW w:type="dxa" w:w="2200"/>
             <w:tcMar>
-              <w:top w:type="dxa" w:w="60"/>
+              <w:top w:type="dxa" w:w="70"/>
               <w:left w:type="dxa" w:w="100"/>
-              <w:bottom w:type="dxa" w:w="60"/>
+              <w:bottom w:type="dxa" w:w="70"/>
               <w:right w:type="dxa" w:w="100"/>
             </w:tcMar>
             <w:vAlign w:val="center"/>
           </w:tcPr>
           <w:p>
-            <w:pPr>
-              <w:jc w:val="left"/>
-            </w:pPr>
             <w:r>
               <w:rPr>
                 <w:rFonts w:ascii="Times New Roman" w:cs="Times New Roman" w:eastAsia="Times New Roman" w:hAnsi="Times New Roman"/>
@@ -1884,19 +1884,16 @@
         </w:tc>
         <w:tc>
           <w:tcPr>
-            <w:tcW w:type="dxa" w:w="7140"/>
+            <w:tcW w:type="dxa" w:w="7340"/>
             <w:tcMar>
-              <w:top w:type="dxa" w:w="60"/>
+              <w:top w:type="dxa" w:w="70"/>
               <w:left w:type="dxa" w:w="100"/>
-              <w:bottom w:type="dxa" w:w="60"/>
+              <w:bottom w:type="dxa" w:w="70"/>
               <w:right w:type="dxa" w:w="100"/>
             </w:tcMar>
             <w:vAlign w:val="center"/>
           </w:tcPr>
           <w:p>
-            <w:pPr>
-              <w:jc w:val="left"/>
-            </w:pPr>
             <w:r>
               <w:rPr>
                 <w:rFonts w:ascii="Times New Roman" w:cs="Times New Roman" w:eastAsia="Times New Roman" w:hAnsi="Times New Roman"/>
@@ -1914,20 +1911,17 @@
       <w:tr>
         <w:tc>
           <w:tcPr>
-            <w:tcW w:type="dxa" w:w="2400"/>
+            <w:tcW w:type="dxa" w:w="2200"/>
             <w:shd w:fill="F2F2F3" w:color="auto" w:val="clear"/>
             <w:tcMar>
-              <w:top w:type="dxa" w:w="60"/>
+              <w:top w:type="dxa" w:w="70"/>
               <w:left w:type="dxa" w:w="100"/>
-              <w:bottom w:type="dxa" w:w="60"/>
+              <w:bottom w:type="dxa" w:w="70"/>
               <w:right w:type="dxa" w:w="100"/>
             </w:tcMar>
             <w:vAlign w:val="center"/>
           </w:tcPr>
           <w:p>
-            <w:pPr>
-              <w:jc w:val="left"/>
-            </w:pPr>
             <w:r>
               <w:rPr>
                 <w:rFonts w:ascii="Times New Roman" w:cs="Times New Roman" w:eastAsia="Times New Roman" w:hAnsi="Times New Roman"/>
@@ -1943,20 +1937,17 @@
         </w:tc>
         <w:tc>
           <w:tcPr>
-            <w:tcW w:type="dxa" w:w="7140"/>
+            <w:tcW w:type="dxa" w:w="7340"/>
             <w:shd w:fill="F2F2F3" w:color="auto" w:val="clear"/>
             <w:tcMar>
-              <w:top w:type="dxa" w:w="60"/>
+              <w:top w:type="dxa" w:w="70"/>
               <w:left w:type="dxa" w:w="100"/>
-              <w:bottom w:type="dxa" w:w="60"/>
+              <w:bottom w:type="dxa" w:w="70"/>
               <w:right w:type="dxa" w:w="100"/>
             </w:tcMar>
             <w:vAlign w:val="center"/>
           </w:tcPr>
           <w:p>
-            <w:pPr>
-              <w:jc w:val="left"/>
-            </w:pPr>
             <w:r>
               <w:rPr>
                 <w:rFonts w:ascii="Times New Roman" w:cs="Times New Roman" w:eastAsia="Times New Roman" w:hAnsi="Times New Roman"/>
@@ -1971,12 +1962,59 @@
           </w:p>
         </w:tc>
       </w:tr>
+      <w:tr>
+        <w:tc>
+          <w:tcPr>
+            <w:tcW w:type="dxa" w:w="2200"/>
+            <w:tcMar>
+              <w:top w:type="dxa" w:w="70"/>
+              <w:left w:type="dxa" w:w="100"/>
+              <w:bottom w:type="dxa" w:w="70"/>
+              <w:right w:type="dxa" w:w="100"/>
+            </w:tcMar>
+            <w:vAlign w:val="center"/>
+          </w:tcPr>
+          <w:p>
+            <w:r>
+              <w:rPr>
+                <w:rFonts w:ascii="Times New Roman" w:cs="Times New Roman" w:eastAsia="Times New Roman" w:hAnsi="Times New Roman"/>
+                <w:b w:val="false"/>
+                <w:bCs w:val="false"/>
+                <w:color w:val="58595B"/>
+                <w:sz w:val="19"/>
+                <w:szCs w:val="19"/>
+              </w:rPr>
+              <w:t xml:space="preserve">AI Provider key</w:t>
+            </w:r>
+          </w:p>
+        </w:tc>
+        <w:tc>
+          <w:tcPr>
+            <w:tcW w:type="dxa" w:w="7340"/>
+            <w:tcMar>
+              <w:top w:type="dxa" w:w="70"/>
+              <w:left w:type="dxa" w:w="100"/>
+              <w:bottom w:type="dxa" w:w="70"/>
+              <w:right w:type="dxa" w:w="100"/>
+            </w:tcMar>
+            <w:vAlign w:val="center"/>
+          </w:tcPr>
+          <w:p>
+            <w:r>
+              <w:rPr>
+                <w:rFonts w:ascii="Times New Roman" w:cs="Times New Roman" w:eastAsia="Times New Roman" w:hAnsi="Times New Roman"/>
+                <w:b w:val="false"/>
+                <w:bCs w:val="false"/>
+                <w:color w:val="58595B"/>
+                <w:sz w:val="19"/>
+                <w:szCs w:val="19"/>
+              </w:rPr>
+              <w:t xml:space="preserve">The Anthropic API key (Section 7) is stored in plain text in server/data/db.json or server/.env. For a shared/production deployment, keep server/.env out of version control and restrict file permissions on server/data/db.json.</w:t>
+            </w:r>
+          </w:p>
+        </w:tc>
+      </w:tr>
     </w:tbl>
-    <w:p>
-      <w:pPr>
-        <w:spacing w:after="100"/>
-      </w:pPr>
-    </w:p>
     <w:p>
       <w:pPr>
         <w:spacing w:after="160" w:line="276"/>
@@ -2009,7 +2047,7 @@
           <w:sz w:val="34"/>
           <w:szCs w:val="34"/>
         </w:rPr>
-        <w:t xml:space="preserve">10. End of Installation Guide</w:t>
+        <w:t xml:space="preserve">11. End of Installation Guide</w:t>
       </w:r>
     </w:p>
     <w:p>
@@ -2035,7 +2073,7 @@
       <w:headerReference w:type="default" r:id="rId7"/>
       <w:footerReference w:type="default" r:id="rId8"/>
       <w:pgSz w:w="12240" w:h="15840" w:orient="portrait"/>
-      <w:pgMar w:top="1080" w:right="1080" w:bottom="1080" w:left="1080" w:header="708" w:footer="708" w:gutter="0"/>
+      <w:pgMar w:top="1000" w:right="1000" w:bottom="1000" w:left="1000" w:header="708" w:footer="708" w:gutter="0"/>
       <w:pgNumType/>
       <w:docGrid w:linePitch="360"/>
     </w:sectPr>
@@ -2094,26 +2132,17 @@
       <w:rPr>
         <w:rFonts w:ascii="Times New Roman" w:cs="Times New Roman" w:eastAsia="Times New Roman" w:hAnsi="Times New Roman"/>
         <w:color w:val="808184"/>
-        <w:sz w:val="16"/>
-        <w:szCs w:val="16"/>
+        <w:sz w:val="14"/>
+        <w:szCs w:val="14"/>
       </w:rPr>
-      <w:t xml:space="preserve">DynamicBA — </w:t>
+      <w:t xml:space="preserve">DynamicBA Specification Package — Page </w:t>
     </w:r>
     <w:r>
       <w:rPr>
         <w:rFonts w:ascii="Times New Roman" w:cs="Times New Roman" w:eastAsia="Times New Roman" w:hAnsi="Times New Roman"/>
         <w:color w:val="808184"/>
-        <w:sz w:val="16"/>
-        <w:szCs w:val="16"/>
-      </w:rPr>
-      <w:t xml:space="preserve">Page </w:t>
-    </w:r>
-    <w:r>
-      <w:rPr>
-        <w:rFonts w:ascii="Times New Roman" w:cs="Times New Roman" w:eastAsia="Times New Roman" w:hAnsi="Times New Roman"/>
-        <w:color w:val="808184"/>
-        <w:sz w:val="16"/>
-        <w:szCs w:val="16"/>
+        <w:sz w:val="14"/>
+        <w:szCs w:val="14"/>
       </w:rPr>
       <w:fldChar w:fldCharType="begin"/>
       <w:instrText xml:space="preserve">PAGE</w:instrText>
@@ -2124,8 +2153,8 @@
       <w:rPr>
         <w:rFonts w:ascii="Times New Roman" w:cs="Times New Roman" w:eastAsia="Times New Roman" w:hAnsi="Times New Roman"/>
         <w:color w:val="808184"/>
-        <w:sz w:val="16"/>
-        <w:szCs w:val="16"/>
+        <w:sz w:val="14"/>
+        <w:szCs w:val="14"/>
       </w:rPr>
       <w:t xml:space="preserve"> of </w:t>
     </w:r>
@@ -2133,8 +2162,8 @@
       <w:rPr>
         <w:rFonts w:ascii="Times New Roman" w:cs="Times New Roman" w:eastAsia="Times New Roman" w:hAnsi="Times New Roman"/>
         <w:color w:val="808184"/>
-        <w:sz w:val="16"/>
-        <w:szCs w:val="16"/>
+        <w:sz w:val="14"/>
+        <w:szCs w:val="14"/>
       </w:rPr>
       <w:fldChar w:fldCharType="begin"/>
       <w:instrText xml:space="preserve">NUMPAGES</w:instrText>
@@ -2189,27 +2218,15 @@
       <w:pBdr>
         <w:bottom w:val="single" w:color="E3E3E4" w:sz="4" w:space="4"/>
       </w:pBdr>
-      <w:tabs>
-        <w:tab w:val="right" w:pos="9026"/>
-      </w:tabs>
     </w:pPr>
     <w:r>
       <w:rPr>
         <w:rFonts w:ascii="Times New Roman" w:cs="Times New Roman" w:eastAsia="Times New Roman" w:hAnsi="Times New Roman"/>
         <w:color w:val="808184"/>
-        <w:sz w:val="16"/>
-        <w:szCs w:val="16"/>
+        <w:sz w:val="14"/>
+        <w:szCs w:val="14"/>
       </w:rPr>
-      <w:t xml:space="preserve">POWERACT Consulting</w:t>
-    </w:r>
-    <w:r>
-      <w:rPr>
-        <w:rFonts w:ascii="Times New Roman" w:cs="Times New Roman" w:eastAsia="Times New Roman" w:hAnsi="Times New Roman"/>
-        <w:color w:val="808184"/>
-        <w:sz w:val="16"/>
-        <w:szCs w:val="16"/>
-      </w:rPr>
-      <w:t xml:space="preserve">	DynamicBA</w:t>
+      <w:t xml:space="preserve">POWERACT Consulting — DynamicBA — Installation Guide</w:t>
     </w:r>
   </w:p>
 </w:hdr>
@@ -2301,53 +2318,8 @@
       </w:pPr>
     </w:lvl>
   </w:abstractNum>
-  <w:abstractNum w:abstractNumId="2" w15:restartNumberingAfterBreak="0">
-    <w:multiLevelType w:val="hybridMultilevel"/>
-    <w:lvl w:ilvl="0" w15:tentative="1">
-      <w:start w:val="1"/>
-      <w:numFmt w:val="bullet"/>
-      <w:lvlText w:val="•"/>
-      <w:lvlJc w:val="left"/>
-      <w:pPr>
-        <w:ind w:left="480" w:hanging="260"/>
-      </w:pPr>
-    </w:lvl>
-    <w:lvl w:ilvl="1" w15:tentative="1">
-      <w:start w:val="1"/>
-      <w:numFmt w:val="bullet"/>
-      <w:lvlText w:val="◦"/>
-      <w:lvlJc w:val="left"/>
-      <w:pPr>
-        <w:ind w:left="900" w:hanging="260"/>
-      </w:pPr>
-    </w:lvl>
-  </w:abstractNum>
-  <w:abstractNum w:abstractNumId="3" w15:restartNumberingAfterBreak="0">
-    <w:multiLevelType w:val="hybridMultilevel"/>
-    <w:lvl w:ilvl="0" w15:tentative="1">
-      <w:start w:val="1"/>
-      <w:numFmt w:val="decimal"/>
-      <w:lvlText w:val="%1."/>
-      <w:lvlJc w:val="left"/>
-      <w:pPr>
-        <w:ind w:left="480" w:hanging="260"/>
-      </w:pPr>
-    </w:lvl>
-  </w:abstractNum>
   <w:num w:numId="1">
     <w:abstractNumId w:val="1"/>
-    <w:lvlOverride w:ilvl="0">
-      <w:startOverride w:val="1"/>
-    </w:lvlOverride>
-  </w:num>
-  <w:num w:numId="2">
-    <w:abstractNumId w:val="2"/>
-    <w:lvlOverride w:ilvl="0">
-      <w:startOverride w:val="1"/>
-    </w:lvlOverride>
-  </w:num>
-  <w:num w:numId="3">
-    <w:abstractNumId w:val="3"/>
     <w:lvlOverride w:ilvl="0">
       <w:startOverride w:val="1"/>
     </w:lvlOverride>
@@ -2554,7 +2526,6 @@
         <w:bottom w:val="single" w:color="E07B00" w:sz="6" w:space="4"/>
       </w:pBdr>
       <w:spacing w:after="200" w:before="360"/>
-      <w:jc w:val="left"/>
       <w:outlineLvl w:val="0"/>
     </w:pPr>
     <w:rPr>
@@ -2573,7 +2544,6 @@
     <w:qFormat/>
     <w:pPr>
       <w:spacing w:after="140" w:before="260"/>
-      <w:jc w:val="left"/>
       <w:outlineLvl w:val="1"/>
     </w:pPr>
     <w:rPr>
@@ -2592,7 +2562,6 @@
     <w:qFormat/>
     <w:pPr>
       <w:spacing w:after="100" w:before="200"/>
-      <w:jc w:val="left"/>
       <w:outlineLvl w:val="2"/>
     </w:pPr>
     <w:rPr>
@@ -2604,22 +2573,5 @@
       <w:szCs w:val="24"/>
     </w:rPr>
   </w:style>
-  <w:style w:type="paragraph" w:styleId="Caption">
-    <w:name w:val="Caption"/>
-    <w:basedOn w:val="Normal"/>
-    <w:next w:val="Normal"/>
-    <w:pPr>
-      <w:spacing w:after="200" w:before="60"/>
-      <w:jc w:val="left"/>
-    </w:pPr>
-    <w:rPr>
-      <w:rFonts w:ascii="Times New Roman" w:cs="Times New Roman" w:eastAsia="Times New Roman" w:hAnsi="Times New Roman"/>
-      <w:i/>
-      <w:iCs/>
-      <w:color w:val="58595B"/>
-      <w:sz w:val="19"/>
-      <w:szCs w:val="19"/>
-    </w:rPr>
-  </w:style>
 </w:styles>
 </file>
</xml_diff>

<commit_message>
Remove all POWERACT branding from the app and both guides
Drops every "POWERACT Consulting" mention: the login/signup screen's
eyebrow and footer, the sidebar's brand eyebrow, the demo seed data's
organization name (now "Demo Consulting Practice"), and the masthead/
running header on every generated document (in-app exports and both
guides) — replaced with a plain DynamicBA identity. The visual design
system (colors, typography, layout) is unchanged; only the company
name and its taglines are removed.

Co-Authored-By: Claude Sonnet 5 <noreply@anthropic.com>
Claude-Session: https://claude.ai/code/session_015bbirj7KLvonURfn9eEcya
</commit_message>
<xml_diff>
--- a/dynamicba/docs/DynamicBA_Installation_Guide.docx
+++ b/dynamicba/docs/DynamicBA_Installation_Guide.docx
@@ -20,7 +20,7 @@
           <w:sz w:val="40"/>
           <w:szCs w:val="40"/>
         </w:rPr>
-        <w:t xml:space="preserve">POWERACT</w:t>
+        <w:t xml:space="preserve">Dynamic</w:t>
       </w:r>
       <w:r>
         <w:rPr>
@@ -31,7 +31,7 @@
           <w:sz w:val="40"/>
           <w:szCs w:val="40"/>
         </w:rPr>
-        <w:t xml:space="preserve"> CONSULTING</w:t>
+        <w:t xml:space="preserve">BA</w:t>
       </w:r>
     </w:p>
     <w:p>
@@ -48,7 +48,7 @@
           <w:sz w:val="18"/>
           <w:szCs w:val="18"/>
         </w:rPr>
-        <w:t xml:space="preserve">Powered by DynamicBA — AI-assisted scope-to-specs automation</w:t>
+        <w:t xml:space="preserve">AI-assisted scope-to-specs automation</w:t>
       </w:r>
     </w:p>
     <w:p>
@@ -114,7 +114,7 @@
           <w:sz w:val="20"/>
           <w:szCs w:val="20"/>
         </w:rPr>
-        <w:t xml:space="preserve">POWERACT Consulting — Internal &amp; Client Distribution</w:t>
+        <w:t xml:space="preserve">Internal &amp; Client Distribution</w:t>
       </w:r>
     </w:p>
     <w:p>
@@ -2226,7 +2226,7 @@
         <w:sz w:val="14"/>
         <w:szCs w:val="14"/>
       </w:rPr>
-      <w:t xml:space="preserve">POWERACT Consulting — DynamicBA — Installation Guide</w:t>
+      <w:t xml:space="preserve">DynamicBA — DynamicBA — Installation Guide</w:t>
     </w:r>
   </w:p>
 </w:hdr>

</xml_diff>